<commit_message>
Swap API Integration practical to SPC's real Ocean Observations API
</commit_message>
<xml_diff>
--- a/04-api-integration/Practical_7_Handout.docx
+++ b/04-api-integration/Practical_7_Handout.docx
@@ -3,9 +3,6 @@
 <w:document xmlns:wpc="http://schemas.microsoft.com/office/word/2010/wordprocessingCanvas" xmlns:mo="http://schemas.microsoft.com/office/mac/office/2008/main" xmlns:mc="http://schemas.openxmlformats.org/markup-compatibility/2006" xmlns:mv="urn:schemas-microsoft-com:mac:vml" xmlns:o="urn:schemas-microsoft-com:office:office" xmlns:r="http://schemas.openxmlformats.org/officeDocument/2006/relationships" xmlns:m="http://schemas.openxmlformats.org/officeDocument/2006/math" xmlns:v="urn:schemas-microsoft-com:vml" xmlns:wp14="http://schemas.microsoft.com/office/word/2010/wordprocessingDrawing" xmlns:wp="http://schemas.openxmlformats.org/drawingml/2006/wordprocessingDrawing" xmlns:w10="urn:schemas-microsoft-com:office:word" xmlns:w="http://schemas.openxmlformats.org/wordprocessingml/2006/main" xmlns:w14="http://schemas.microsoft.com/office/word/2010/wordml" xmlns:wpg="http://schemas.microsoft.com/office/word/2010/wordprocessingGroup" xmlns:wpi="http://schemas.microsoft.com/office/word/2010/wordprocessingInk" xmlns:wne="http://schemas.microsoft.com/office/word/2006/wordml" xmlns:wps="http://schemas.microsoft.com/office/word/2010/wordprocessingShape" mc:Ignorable="w14 wp14">
   <w:body>
     <w:p>
-      <w:pPr>
-        <w:jc w:val="left"/>
-      </w:pPr>
       <w:r>
         <w:rPr>
           <w:b/>
@@ -16,9 +13,6 @@
       </w:r>
     </w:p>
     <w:p>
-      <w:pPr>
-        <w:jc w:val="left"/>
-      </w:pPr>
       <w:r>
         <w:rPr>
           <w:b/>
@@ -46,7 +40,7 @@
           <w:i w:val="0"/>
           <w:sz w:val="22"/>
         </w:rPr>
-        <w:t>This handout is the hands-on companion to the API Integration session. You will call a real API from your browser, fetch data with JavaScript, embed it on a page, and plan your own country’s API opportunity.</w:t>
+        <w:t>This handout is the hands-on companion to the API Integration session. You will explore a real, live Pacific data API - SPC’s own Ocean Observations API - call it from your browser, fetch data with JavaScript, embed it on a page, and plan your own country’s API opportunity.</w:t>
       </w:r>
     </w:p>
     <w:p>
@@ -82,7 +76,7 @@
         <w:pStyle w:val="ListBullet"/>
       </w:pPr>
       <w:r>
-        <w:t>fetch_example.html - a ready-made live rainfall widget</w:t>
+        <w:t>fetch_example.html - a ready-made live sea level widget</w:t>
       </w:r>
     </w:p>
     <w:p>
@@ -90,7 +84,7 @@
         <w:pStyle w:val="ListBullet"/>
       </w:pPr>
       <w:r>
-        <w:t>api_reference.md - the list of free APIs and example URLs</w:t>
+        <w:t>api_reference.md - the SPC Ocean Observations API plus other free APIs</w:t>
       </w:r>
     </w:p>
     <w:p>
@@ -105,7 +99,7 @@
           <w:color w:val="02C39A"/>
           <w:sz w:val="30"/>
         </w:rPr>
-        <w:t>Part A — Anatomy of a Request  (10 min)</w:t>
+        <w:t>Part A — Explore the Stations, Then One Station’s Data  (15 min)</w:t>
       </w:r>
     </w:p>
     <w:p>
@@ -115,7 +109,15 @@
           <w:i w:val="0"/>
           <w:sz w:val="22"/>
         </w:rPr>
-        <w:t>Paste this URL into your browser address bar:</w:t>
+        <w:t>SPC runs a real network of ocean sensors across the Pacific - 186 stations in total: tide gauges, wave buoys and tsunami (DART) buoys. Let’s see what’s there.</w:t>
+      </w:r>
+    </w:p>
+    <w:p>
+      <w:pPr>
+        <w:pStyle w:val="ListNumber"/>
+      </w:pPr>
+      <w:r>
+        <w:t>Paste this into your browser address bar to see every station:</w:t>
       </w:r>
     </w:p>
     <w:p>
@@ -128,7 +130,7 @@
           <w:color w:val="02664D"/>
           <w:sz w:val="21"/>
         </w:rPr>
-        <w:t>https://api.open-meteo.com/v1/forecast?latitude=-18.1&amp;longitude=178.4&amp;daily=precipitation_sum</w:t>
+        <w:t>https://ocean-obs-api.spc.int/insitu/stations/</w:t>
       </w:r>
     </w:p>
     <w:p>
@@ -136,7 +138,7 @@
         <w:pStyle w:val="ListNumber"/>
       </w:pPr>
       <w:r>
-        <w:t>Find the Base URL (the server address), the Endpoint (/v1/forecast) and the Parameters (latitude, longitude, daily).</w:t>
+        <w:t>That’s a lot of data at once. Use Ctrl+F (Find) in your browser and search for your own country’s name to find a station near you. Note down its station_id.</w:t>
       </w:r>
     </w:p>
     <w:p>
@@ -144,7 +146,20 @@
         <w:pStyle w:val="ListNumber"/>
       </w:pPr>
       <w:r>
-        <w:t>Look at the JSON that comes back. It’s just structured text - find the precipitation_sum value.</w:t>
+        <w:t>Now paste this into your browser to get the actual readings for one station (Samoa’s Auasi tide gauge):</w:t>
+      </w:r>
+    </w:p>
+    <w:p>
+      <w:pPr>
+        <w:ind w:left="432"/>
+      </w:pPr>
+      <w:r>
+        <w:rPr>
+          <w:rFonts w:ascii="Consolas" w:hAnsi="Consolas"/>
+          <w:color w:val="02664D"/>
+          <w:sz w:val="21"/>
+        </w:rPr>
+        <w:t>https://ocean-obs-api.spc.int/insitu/get_data/station/auasi?limit=5</w:t>
       </w:r>
     </w:p>
     <w:p>
@@ -152,7 +167,23 @@
         <w:pStyle w:val="ListNumber"/>
       </w:pPr>
       <w:r>
-        <w:t>Try changing the latitude/longitude in the URL to your own capital city and reload.</w:t>
+        <w:t>Find the Base URL (the server address), the Endpoint (/insitu/get_data/station/auasi) and the Parameter (?limit=5, which controls how many readings come back).</w:t>
+      </w:r>
+    </w:p>
+    <w:p>
+      <w:pPr>
+        <w:pStyle w:val="ListNumber"/>
+      </w:pPr>
+      <w:r>
+        <w:t>Look at the JSON that comes back - find the data array, and the sea_level (m) and time values inside it. The newest reading is always first.</w:t>
+      </w:r>
+    </w:p>
+    <w:p>
+      <w:pPr>
+        <w:pStyle w:val="ListNumber"/>
+      </w:pPr>
+      <w:r>
+        <w:t>Try the same URL with the station_id you found for your own country in step 2 (or use one from the table in api_reference.md).</w:t>
       </w:r>
     </w:p>
     <w:p>
@@ -198,33 +229,7 @@
           <w:color w:val="02664D"/>
           <w:sz w:val="21"/>
         </w:rPr>
-        <w:t>fetch("https://api.open-meteo.com/v1/forecast" +</w:t>
-      </w:r>
-    </w:p>
-    <w:p>
-      <w:pPr>
-        <w:ind w:left="432"/>
-      </w:pPr>
-      <w:r>
-        <w:rPr>
-          <w:rFonts w:ascii="Consolas" w:hAnsi="Consolas"/>
-          <w:color w:val="02664D"/>
-          <w:sz w:val="21"/>
-        </w:rPr>
-        <w:t xml:space="preserve">      "?latitude=-18.1&amp;longitude=178.4" +</w:t>
-      </w:r>
-    </w:p>
-    <w:p>
-      <w:pPr>
-        <w:ind w:left="432"/>
-      </w:pPr>
-      <w:r>
-        <w:rPr>
-          <w:rFonts w:ascii="Consolas" w:hAnsi="Consolas"/>
-          <w:color w:val="02664D"/>
-          <w:sz w:val="21"/>
-        </w:rPr>
-        <w:t xml:space="preserve">      "&amp;daily=precipitation_sum")</w:t>
+        <w:t>fetch("https://ocean-obs-api.spc.int/insitu/get_data/station/auasi?limit=5")</w:t>
       </w:r>
     </w:p>
     <w:p>
@@ -258,7 +263,7 @@
         <w:pStyle w:val="ListNumber"/>
       </w:pPr>
       <w:r>
-        <w:t>Change the latitude/longitude to your own country and re-run it.</w:t>
+        <w:t>Change "auasi" to your own station_id from Part A and re-run it.</w:t>
       </w:r>
     </w:p>
     <w:p>
@@ -281,7 +286,7 @@
         <w:pStyle w:val="ListNumber"/>
       </w:pPr>
       <w:r>
-        <w:t>Open fetch_example.html directly in your browser - you should see a live rainfall figure appear.</w:t>
+        <w:t>Open fetch_example.html directly in your browser - you should see a live sea level reading for Samoa appear.</w:t>
       </w:r>
     </w:p>
     <w:p>
@@ -289,7 +294,7 @@
         <w:pStyle w:val="ListNumber"/>
       </w:pPr>
       <w:r>
-        <w:t>Open the same file in a text editor, find the latitude and longitude variables near the top of the script, and change them to your own country’s capital.</w:t>
+        <w:t>Open the same file in a text editor, find the stationId variable near the top of the script, and change it to your own country’s station_id.</w:t>
       </w:r>
     </w:p>
     <w:p>
@@ -297,7 +302,7 @@
         <w:pStyle w:val="ListNumber"/>
       </w:pPr>
       <w:r>
-        <w:t>Save the file and refresh the page in your browser - the number should update.</w:t>
+        <w:t>Save the file and refresh the page in your browser - the reading should update to your own station.</w:t>
       </w:r>
     </w:p>
     <w:p>
@@ -372,7 +377,7 @@
             <w:r>
               <w:t>1. What data product do you most want on your website or app?</w:t>
               <w:br/>
-              <w:t>(e.g. daily rainfall, wave height, cyclone warnings)</w:t>
+              <w:t>(e.g. sea level, wave height, cyclone warnings)</w:t>
             </w:r>
           </w:p>
         </w:tc>
@@ -394,7 +399,7 @@
             <w:r>
               <w:t>2. Where does that data currently live?</w:t>
               <w:br/>
-              <w:t>(e.g. CliDE database, Bureau ERDDAP, manual spreadsheet)</w:t>
+              <w:t>(e.g. the SPC Ocean Observations API, CliDE, a manual spreadsheet)</w:t>
             </w:r>
           </w:p>
         </w:tc>
@@ -481,7 +486,7 @@
         <w:pStyle w:val="ListBullet"/>
       </w:pPr>
       <w:r>
-        <w:t>The APIs in api_reference.md are free and need no sign-up - keep practising after the workshop.</w:t>
+        <w:t>The SPC Ocean Observations API is free, needs no sign-up, and already covers many of your own countries - keep exploring it after the workshop.</w:t>
       </w:r>
     </w:p>
     <w:p>

</xml_diff>